<commit_message>
fix: ml15 predict now derives features from a simple IPI history CSV
predict_inline/predict_batch previously required all 16 feature_columns already
computed. A caller supplying only date+ipi_national_current (e.g. the AI team's own
data/input/ipi_history.csv) got no valid response. Bundles the two reference CSVs
(global_phytosanitary_prices_b2020.csv, financial_proxies_monthly.csv) alongside the
model artifact and ports build_inference_panel_from_history from the original
predictor.py to derive missing features from them.

Verified against ipi_history.csv end to end (15/15 rows, 0 errors) and against the
existing golden dataset (13/13, diff 0.0) via the real HTTP endpoint.
</commit_message>
<xml_diff>
--- a/outputs/a15/a15_ficha_funcional.docx
+++ b/outputs/a15/a15_ficha_funcional.docx
@@ -578,7 +578,7 @@
           </w:tcPr>
           <w:p ns2:paraId="40956F30" ns2:textId="77777777">
             <w:r>
-              <w:t xml:space="preserve">Modo predict inline: se aportan las 16 variables del contrato del artefacto (o bien un subconjunto más 'date'/'origin_date', del que se derivan automáticamente las 4 variables de calendario) y se obtiene la predicción del IPI nacional a 6 meses vista. Modo predict batch: mismo contrato de entrada, una fila por predicción, sobre un CSV. Modo train: reentrena desde cero un Pipeline StandardScaler+Ridge(alpha=25.0) — mismos hiperparámetros que el equipo de IA — a partir de un CSV con las 16 features más el target histórico, evaluando sobre un holdout cronológico del propio CSV; el artefacto fijo servido en producción nunca se sobrescribe.</w:t>
+              <w:t xml:space="preserve">Modo predict inline: se aportan las 16 variables del contrato del artefacto, o solo un subconjunto (incluso solo 'date') — el resto se deriva automáticamente desde 'date'/'origin_date' y un histórico de referencia bundled (retardos autorregresivos y exógenos, más las 4 variables de calendario) — y se obtiene la predicción del IPI nacional a 6 meses vista. Modo predict batch: acepta un CSV con el panel completo (una fila = una predicción ya calculada) o un histórico simple mensual (date/year+month + ipi_national_current, igual que data/input/ipi_history.csv del equipo de IA), fusionando todas sus filas en el histórico de referencia para derivar cada predicción. Modo train: reentrena desde cero un Pipeline StandardScaler+Ridge(alpha=25.0) — mismos hiperparámetros que el equipo de IA — a partir de un CSV con las 16 features más el target histórico, evaluando sobre un holdout cronológico del propio CSV; el artefacto fijo servido en producción nunca se sobrescribe.</w:t>
             </w:r>
           </w:p>
         </w:tc>
@@ -2060,7 +2060,7 @@
           </w:tcPr>
           <w:p ns2:paraId="4308B354" ns2:textId="77777777">
             <w:r>
-              <w:t xml:space="preserve">El servicio no reconstruye retardos desde series brutas</w:t>
+              <w:t xml:space="preserve">Histórico de referencia bundled, no auto-actualizable</w:t>
             </w:r>
           </w:p>
         </w:tc>
@@ -2083,7 +2083,7 @@
           </w:tcPr>
           <w:p ns2:paraId="3FD46393" ns2:textId="77777777">
             <w:r>
-              <w:t xml:space="preserve">A diferencia del pipeline original del equipo de IA, que calcula los 16 retardos internamente a partir de históricos de precios acumulados, este servicio espera que el cliente aporte ya las variables retardadas (o el histórico completo vía 'date' solo para las 4 variables de calendario). Esta decisión evita depender de un dataset de referencia interno que se quedaría obsoleto sin actualización periódica, pero traslada la responsabilidad de construir el vector de features al sistema que consume el modelo.</w:t>
+              <w:t xml:space="preserve">El servicio reconstruye los retardos automáticamente (igual que el pipeline original) a partir de dos CSV de referencia empaquetados junto al modelo (snapshot hasta feb-2026/jun-2026). Para fechas posteriores al snapshot hace falta aportar 'ipi_national_current' explícitamente (o, en modo batch, que el propio CSV de entrada incluya esos meses). El snapshot no se refresca solo — requiere que el equipo de IA regenere y resuba los ficheros de referencia periódicamente.</w:t>
             </w:r>
           </w:p>
         </w:tc>

</xml_diff>